<commit_message>
Documentation + Digital Signatures
</commit_message>
<xml_diff>
--- a/Practicas Preprofesionales/Editables/03MerinoEdnanEvTutorEmpresarial.docx
+++ b/Practicas Preprofesionales/Editables/03MerinoEdnanEvTutorEmpresarial.docx
@@ -4405,6 +4405,7 @@
                 </w:p>
                 <w:p>
                   <w:pPr>
+                    <w:jc w:val="center"/>
                     <w:rPr>
                       <w:b/>
                       <w:sz w:val="16"/>
@@ -4417,7 +4418,7 @@
                       <w:sz w:val="16"/>
                       <w:szCs w:val="16"/>
                     </w:rPr>
-                    <w:t>Tutor Empresarial / Institucional/ Representante de la Comunidad</w:t>
+                    <w:t>Tutor Empresarial</w:t>
                   </w:r>
                 </w:p>
                 <w:p>
@@ -6525,7 +6526,7 @@
 </file>
 
 <file path=customXml/itemProps1.xml><?xml version="1.0" encoding="utf-8"?>
-<ds:datastoreItem xmlns:ds="http://schemas.openxmlformats.org/officeDocument/2006/customXml" ds:itemID="{DAEDE869-D89C-440A-A1E2-30AB270B74A5}">
+<ds:datastoreItem xmlns:ds="http://schemas.openxmlformats.org/officeDocument/2006/customXml" ds:itemID="{A4CBF857-1C11-4E71-A145-10460AC6A6DF}">
   <ds:schemaRefs>
     <ds:schemaRef ds:uri="http://schemas.openxmlformats.org/officeDocument/2006/bibliography"/>
   </ds:schemaRefs>

</xml_diff>